<commit_message>
Corrige XML del DOCX: atributos duplicados y posicion de w:jc que impedian abrirlo
</commit_message>
<xml_diff>
--- a/Curriculum_Jorge_Gutierrez.docx
+++ b/Curriculum_Jorge_Gutierrez.docx
@@ -1,5 +1,710 @@
 
-<file path=word/document.xml><?xml version="1.0" encoding="UTF-8"?><w:document xmlns:w="http://schemas.openxmlformats.org/wordprocessingml/2006/main" xmlns:m="http://schemas.openxmlformats.org/officeDocument/2006/math" xmlns:r="http://schemas.openxmlformats.org/officeDocument/2006/relationships" xmlns:o="urn:schemas-microsoft-com:office:office" xmlns:v="urn:schemas-microsoft-com:vml" xmlns:w10="urn:schemas-microsoft-com:office:word" xmlns:a="http://schemas.openxmlformats.org/drawingml/2006/main" xmlns:pic="http://schemas.openxmlformats.org/drawingml/2006/picture" xmlns:wp="http://schemas.openxmlformats.org/drawingml/2006/wordprocessingDrawing"><w:body><w:p><w:pPr><w:pStyle w:val="Title" /></w:pPr><w:r><w:t xml:space="preserve">Jorge</w:t></w:r><w:r><w:t xml:space="preserve"> </w:t></w:r><w:r><w:t xml:space="preserve">Alberto</w:t></w:r><w:r><w:t xml:space="preserve"> </w:t></w:r><w:r><w:t xml:space="preserve">Gutierrez</w:t></w:r><w:r><w:t xml:space="preserve"> </w:t></w:r><w:r><w:t xml:space="preserve">Torres</w:t></w:r></w:p><w:p><w:pPr><w:pStyle w:val="Subtitle" /></w:pPr><w:r><w:t xml:space="preserve">Auditoría</w:t></w:r><w:r><w:t xml:space="preserve"> </w:t></w:r><w:r><w:t xml:space="preserve">de</w:t></w:r><w:r><w:t xml:space="preserve"> </w:t></w:r><w:r><w:t xml:space="preserve">Sistemas</w:t></w:r><w:r><w:t xml:space="preserve"> </w:t></w:r><w:r><w:t xml:space="preserve">&amp;</w:t></w:r><w:r><w:t xml:space="preserve"> </w:t></w:r><w:r><w:t xml:space="preserve">Análisis</w:t></w:r><w:r><w:t xml:space="preserve"> </w:t></w:r><w:r><w:t xml:space="preserve">de</w:t></w:r><w:r><w:t xml:space="preserve"> </w:t></w:r><w:r><w:t xml:space="preserve">Datos</w:t></w:r></w:p><w:p><w:pPr><w:jc w:val="center"/><w:pStyle w:val="FirstParagraph" /></w:pPr><w:r><w:drawing><wp:inline><wp:extent cx="1095375" cy="1095375" /><wp:effectExtent b="0" l="0" r="0" t="0" /><wp:docPr descr="" title="" id="21" name="Picture"  descr="Foto de Jorge Gutierrez" name="Foto Jorge Gutierrez"/><a:graphic><a:graphicData uri="http://schemas.openxmlformats.org/drawingml/2006/picture"><pic:pic><pic:nvPicPr><pic:cNvPr descr="imagenes/fotohv.jpg" id="22" name="Picture"  descr="Foto de Jorge Gutierrez"/><pic:cNvPicPr><a:picLocks noChangeArrowheads="1" noChangeAspect="1" /></pic:cNvPicPr></pic:nvPicPr><pic:blipFill><a:blip r:embed="rId20" /><a:stretch><a:fillRect /></a:stretch></pic:blipFill><pic:spPr bwMode="auto"><a:xfrm><a:off x="0" y="0" /><a:ext cx="1095375" cy="1095375" /></a:xfrm><a:prstGeom prst="rect"><a:avLst /></a:prstGeom><a:noFill /><a:ln w="9525"><a:noFill /><a:headEnd /><a:tailEnd /></a:ln></pic:spPr></pic:pic></a:graphicData></a:graphic></wp:inline></w:drawing></w:r></w:p><w:p><w:pPr><w:pStyle w:val="BodyText" /></w:pPr><w:r><w:rPr><w:bCs /><w:b /></w:rPr><w:t xml:space="preserve">IT Support &amp; Management · Auditoría · Análisis de Datos · IA Aplicada</w:t></w:r></w:p><w:p><w:pPr><w:pStyle w:val="BodyText" /></w:pPr><w:r><w:t xml:space="preserve">jorge042888@gmail.com · (+57) 3024781168 · github.com/jorge042888</w:t></w:r></w:p><w:bookmarkStart w:id="23" w:name="perfil-profesional" /><w:p><w:pPr><w:pStyle w:val="Heading2" /></w:pPr><w:r><w:t xml:space="preserve">Perfil profesional</w:t></w:r></w:p><w:p><w:pPr><w:pStyle w:val="FirstParagraph" /></w:pPr><w:r><w:t xml:space="preserve">Técnico en sistemas / Estudiante de Ingeniería de Sistemas con experiencia combinada en</w:t></w:r><w:r><w:t xml:space="preserve"> </w:t></w:r><w:r><w:rPr><w:bCs /><w:b /></w:rPr><w:t xml:space="preserve">soporte y gestión TI</w:t></w:r><w:r><w:t xml:space="preserve">, análisis de datos y</w:t></w:r><w:r><w:t xml:space="preserve"> </w:t></w:r><w:r><w:rPr><w:bCs /><w:b /></w:rPr><w:t xml:space="preserve">evaluación de riesgos tecnológicos</w:t></w:r><w:r><w:t xml:space="preserve">. He brindado soporte técnico integral a usuarios finales (mantenimiento, configuración, redes) y he participado en la evaluación de procesos e infraestructura TI bajo el marco</w:t></w:r><w:r><w:t xml:space="preserve"> </w:t></w:r><w:r><w:rPr><w:bCs /><w:b /></w:rPr><w:t xml:space="preserve">ISO 27001</w:t></w:r><w:r><w:t xml:space="preserve">, identificando riesgos y proponiendo controles. Complemento este perfil con análisis funcional de datos en</w:t></w:r><w:r><w:t xml:space="preserve"> </w:t></w:r><w:r><w:rPr><w:bCs /><w:b /></w:rPr><w:t xml:space="preserve">Excel, Power BI, SQL y Python</w:t></w:r><w:r><w:t xml:space="preserve">, y con el uso activo de herramientas de</w:t></w:r><w:r><w:t xml:space="preserve"> </w:t></w:r><w:r><w:rPr><w:bCs /><w:b /></w:rPr><w:t xml:space="preserve">inteligencia artificial (Claude, ChatGPT Business, OpenCode)</w:t></w:r><w:r><w:t xml:space="preserve"> </w:t></w:r><w:r><w:t xml:space="preserve">para automatizar tareas técnicas y acelerar el análisis. Usuario de entorno Linux.</w:t></w:r></w:p><w:bookmarkEnd w:id="23" /><w:bookmarkStart w:id="24" w:name="habilidades-técnicas" /><w:p><w:pPr><w:pStyle w:val="Heading2" /></w:pPr><w:r><w:t xml:space="preserve">Habilidades técnicas</w:t></w:r></w:p><w:p><w:pPr><w:pStyle w:val="FirstParagraph" /></w:pPr><w:r><w:rPr><w:bCs /><w:b /></w:rPr><w:t xml:space="preserve">Skills:</w:t></w:r><w:r><w:t xml:space="preserve"> </w:t></w:r><w:r><w:t xml:space="preserve">Python · SQL · Excel · Power BI · Linux · VS Code · Claude · ChatGPT · OpenCode · GitHub</w:t></w:r></w:p><w:p><w:pPr><w:pStyle w:val="BodyText" /></w:pPr><w:r><w:rPr><w:bCs /><w:b /></w:rPr><w:t xml:space="preserve">IT Support &amp; Management</w:t></w:r></w:p><w:p><w:pPr><w:numPr><w:ilvl w:val="0" /><w:numId w:val="1001" /></w:numPr><w:pStyle w:val="Compact" /></w:pPr><w:r><w:t xml:space="preserve">Mantenimiento preventivo/correctivo</w:t></w:r></w:p><w:p><w:pPr><w:numPr><w:ilvl w:val="0" /><w:numId w:val="1001" /></w:numPr><w:pStyle w:val="Compact" /></w:pPr><w:r><w:t xml:space="preserve">Instalación y configuración HW/SW</w:t></w:r></w:p><w:p><w:pPr><w:numPr><w:ilvl w:val="0" /><w:numId w:val="1001" /></w:numPr><w:pStyle w:val="Compact" /></w:pPr><w:r><w:t xml:space="preserve">Recuperación/clonación de discos</w:t></w:r></w:p><w:p><w:pPr><w:numPr><w:ilvl w:val="0" /><w:numId w:val="1001" /></w:numPr><w:pStyle w:val="Compact" /></w:pPr><w:r><w:t xml:space="preserve">Soporte ofimático</w:t></w:r></w:p><w:p><w:pPr><w:numPr><w:ilvl w:val="0" /><w:numId w:val="1001" /></w:numPr><w:pStyle w:val="Compact" /></w:pPr><w:r><w:t xml:space="preserve">Diagnóstico de infraestructura TI</w:t></w:r></w:p><w:p><w:pPr><w:pStyle w:val="FirstParagraph" /></w:pPr><w:r><w:rPr><w:bCs /><w:b /></w:rPr><w:t xml:space="preserve">Riesgos &amp; Controles TI</w:t></w:r></w:p><w:p><w:pPr><w:numPr><w:ilvl w:val="0" /><w:numId w:val="1002" /></w:numPr><w:pStyle w:val="Compact" /></w:pPr><w:r><w:t xml:space="preserve">Levantamiento de información</w:t></w:r></w:p><w:p><w:pPr><w:numPr><w:ilvl w:val="0" /><w:numId w:val="1002" /></w:numPr><w:pStyle w:val="Compact" /></w:pPr><w:r><w:t xml:space="preserve">Evaluación de controles de seguridad</w:t></w:r></w:p><w:p><w:pPr><w:numPr><w:ilvl w:val="0" /><w:numId w:val="1002" /></w:numPr><w:pStyle w:val="Compact" /></w:pPr><w:r><w:t xml:space="preserve">Hallazgos y recomendaciones ISO 27001</w:t></w:r></w:p><w:p><w:pPr><w:numPr><w:ilvl w:val="0" /><w:numId w:val="1002" /></w:numPr><w:pStyle w:val="Compact" /></w:pPr><w:r><w:t xml:space="preserve">Apoyo en IA para auditoría</w:t></w:r></w:p><w:p><w:pPr><w:pStyle w:val="FirstParagraph" /></w:pPr><w:r><w:rPr><w:bCs /><w:b /></w:rPr><w:t xml:space="preserve">Análisis de datos</w:t></w:r></w:p><w:p><w:pPr><w:numPr><w:ilvl w:val="0" /><w:numId w:val="1003" /></w:numPr><w:pStyle w:val="Compact" /></w:pPr><w:r><w:t xml:space="preserve">Excel avanzado</w:t></w:r></w:p><w:p><w:pPr><w:numPr><w:ilvl w:val="0" /><w:numId w:val="1003" /></w:numPr><w:pStyle w:val="Compact" /></w:pPr><w:r><w:t xml:space="preserve">Power BI (modelado, editor de consultas, DAX)</w:t></w:r></w:p><w:p><w:pPr><w:numPr><w:ilvl w:val="0" /><w:numId w:val="1003" /></w:numPr><w:pStyle w:val="Compact" /></w:pPr><w:r><w:t xml:space="preserve">Python (Pandas, NumPy)</w:t></w:r></w:p><w:p><w:pPr><w:numPr><w:ilvl w:val="0" /><w:numId w:val="1003" /></w:numPr><w:pStyle w:val="Compact" /></w:pPr><w:r><w:t xml:space="preserve">SQL</w:t></w:r></w:p><w:p><w:pPr><w:pStyle w:val="FirstParagraph" /></w:pPr><w:r><w:rPr><w:bCs /><w:b /></w:rPr><w:t xml:space="preserve">IA aplicada</w:t></w:r></w:p><w:p><w:pPr><w:numPr><w:ilvl w:val="0" /><w:numId w:val="1004" /></w:numPr><w:pStyle w:val="Compact" /></w:pPr><w:r><w:t xml:space="preserve">Claude — automatización y documentación</w:t></w:r></w:p><w:p><w:pPr><w:numPr><w:ilvl w:val="0" /><w:numId w:val="1004" /></w:numPr><w:pStyle w:val="Compact" /></w:pPr><w:r><w:t xml:space="preserve">OpenCode — agentes de desarrollo</w:t></w:r></w:p><w:p><w:pPr><w:numPr><w:ilvl w:val="0" /><w:numId w:val="1004" /></w:numPr><w:pStyle w:val="Compact" /></w:pPr><w:r><w:t xml:space="preserve">ChatGPT Business — administración de cuentas, usuarios y grupos</w:t></w:r></w:p><w:bookmarkEnd w:id="24" /><w:bookmarkStart w:id="25" w:name="experiencia-laboral" /><w:p><w:pPr><w:pStyle w:val="Heading2" /></w:pPr><w:r><w:t xml:space="preserve">Experiencia laboral</w:t></w:r></w:p><w:p><w:pPr><w:pStyle w:val="FirstParagraph" /></w:pPr><w:r><w:rPr><w:bCs /><w:b /></w:rPr><w:t xml:space="preserve">Gonzalo Millán C. y Asociados</w:t></w:r><w:r><w:t xml:space="preserve"> </w:t></w:r><w:r><w:t xml:space="preserve">—</w:t></w:r><w:r><w:t xml:space="preserve"> </w:t></w:r><w:r><w:rPr><w:iCs /><w:i /></w:rPr><w:t xml:space="preserve">Actualmente</w:t></w:r></w:p><w:p><w:pPr><w:pStyle w:val="BodyText" /></w:pPr><w:r><w:t xml:space="preserve">Evaluación de infraestructura, procesos y controles de seguridad de la información en organizaciones clientes, bajo el marco ISO 27001. Identificación de riesgos tecnológicos y operativos, traducidos en informes con recomendaciones y oportunidades de mejora. Este rol me ha dado visión transversal de cómo se gestionan y aseguran los sistemas de información en distintos entornos.</w:t></w:r></w:p><w:p><w:pPr><w:pStyle w:val="BodyText" /></w:pPr><w:r><w:rPr><w:bCs /><w:b /></w:rPr><w:t xml:space="preserve">Independiente — Soporte T.I</w:t></w:r><w:r><w:t xml:space="preserve"> </w:t></w:r><w:r><w:t xml:space="preserve">—</w:t></w:r><w:r><w:t xml:space="preserve"> </w:t></w:r><w:r><w:rPr><w:iCs /><w:i /></w:rPr><w:t xml:space="preserve">2020 - 2022</w:t></w:r></w:p><w:p><w:pPr><w:pStyle w:val="BodyText" /></w:pPr><w:r><w:t xml:space="preserve">Soporte técnico integral a usuario final: mantenimiento preventivo y correctivo, instalación y configuración de software/hardware. Administración de licencias y aplicaciones de gestión de servicios. Capacitación funcional en Excel e Inteligencia Artificial orientada a productividad.</w:t></w:r></w:p><w:bookmarkEnd w:id="25" /><w:bookmarkStart w:id="26" w:name="formación-académica" /><w:p><w:pPr><w:pStyle w:val="Heading2" /></w:pPr><w:r><w:t xml:space="preserve">Formación académica</w:t></w:r></w:p><w:p><w:pPr><w:numPr><w:ilvl w:val="0" /><w:numId w:val="1005" /></w:numPr><w:pStyle w:val="Compact" /></w:pPr><w:r><w:rPr><w:bCs /><w:b /></w:rPr><w:t xml:space="preserve">Ingeniería de Sistemas</w:t></w:r><w:r><w:t xml:space="preserve"> </w:t></w:r><w:r><w:t xml:space="preserve">— en proceso, Corporación Universitaria Iberoamericana de Bogotá</w:t></w:r></w:p><w:p><w:pPr><w:numPr><w:ilvl w:val="0" /><w:numId w:val="1005" /></w:numPr><w:pStyle w:val="Compact" /></w:pPr><w:r><w:rPr><w:bCs /><w:b /></w:rPr><w:t xml:space="preserve">Técnico en Sistemas</w:t></w:r><w:r><w:t xml:space="preserve"> </w:t></w:r><w:r><w:t xml:space="preserve">— CENAL, 2019-2022</w:t></w:r></w:p><w:bookmarkEnd w:id="26" /><w:bookmarkStart w:id="27" w:name="idiomas" /><w:p><w:pPr><w:pStyle w:val="Heading2" /></w:pPr><w:r><w:t xml:space="preserve">Idiomas</w:t></w:r></w:p><w:p><w:pPr><w:numPr><w:ilvl w:val="0" /><w:numId w:val="1006" /></w:numPr><w:pStyle w:val="Compact" /></w:pPr><w:r><w:rPr><w:bCs /><w:b /></w:rPr><w:t xml:space="preserve">Español:</w:t></w:r><w:r><w:t xml:space="preserve"> </w:t></w:r><w:r><w:t xml:space="preserve">nativo</w:t></w:r></w:p><w:p><w:pPr><w:numPr><w:ilvl w:val="0" /><w:numId w:val="1006" /></w:numPr><w:pStyle w:val="Compact" /></w:pPr><w:r><w:rPr><w:bCs /><w:b /></w:rPr><w:t xml:space="preserve">Inglés:</w:t></w:r><w:r><w:t xml:space="preserve"> </w:t></w:r><w:r><w:t xml:space="preserve">B1</w:t></w:r></w:p><w:bookmarkEnd w:id="27" /><w:bookmarkStart w:id="28" w:name="referencias" /><w:p><w:pPr><w:pStyle w:val="Heading2" /></w:pPr><w:r><w:t xml:space="preserve">Referencias</w:t></w:r></w:p><w:p><w:pPr><w:pStyle w:val="FirstParagraph" /></w:pPr><w:r><w:t xml:space="preserve">Disponibles a solicitud.</w:t></w:r></w:p><w:bookmarkEnd w:id="28" /><w:sectPr /></w:body></w:document>
+<file path=word/document.xml><?xml version="1.0" encoding="utf-8"?>
+<w:document xmlns:w="http://schemas.openxmlformats.org/wordprocessingml/2006/main" xmlns:m="http://schemas.openxmlformats.org/officeDocument/2006/math" xmlns:r="http://schemas.openxmlformats.org/officeDocument/2006/relationships" xmlns:o="urn:schemas-microsoft-com:office:office" xmlns:v="urn:schemas-microsoft-com:vml" xmlns:w10="urn:schemas-microsoft-com:office:word" xmlns:a="http://schemas.openxmlformats.org/drawingml/2006/main" xmlns:pic="http://schemas.openxmlformats.org/drawingml/2006/picture" xmlns:wp="http://schemas.openxmlformats.org/drawingml/2006/wordprocessingDrawing">
+  <w:body>
+    <w:p>
+      <w:pPr>
+        <w:pStyle w:val="Title"/>
+      </w:pPr>
+      <w:r>
+        <w:t xml:space="preserve">Jorge</w:t>
+      </w:r>
+      <w:r>
+        <w:t xml:space="preserve"> </w:t>
+      </w:r>
+      <w:r>
+        <w:t xml:space="preserve">Alberto</w:t>
+      </w:r>
+      <w:r>
+        <w:t xml:space="preserve"> </w:t>
+      </w:r>
+      <w:r>
+        <w:t xml:space="preserve">Gutierrez</w:t>
+      </w:r>
+      <w:r>
+        <w:t xml:space="preserve"> </w:t>
+      </w:r>
+      <w:r>
+        <w:t xml:space="preserve">Torres</w:t>
+      </w:r>
+    </w:p>
+    <w:p>
+      <w:pPr>
+        <w:pStyle w:val="Subtitle"/>
+      </w:pPr>
+      <w:r>
+        <w:t xml:space="preserve">Auditoría</w:t>
+      </w:r>
+      <w:r>
+        <w:t xml:space="preserve"> </w:t>
+      </w:r>
+      <w:r>
+        <w:t xml:space="preserve">de</w:t>
+      </w:r>
+      <w:r>
+        <w:t xml:space="preserve"> </w:t>
+      </w:r>
+      <w:r>
+        <w:t xml:space="preserve">Sistemas</w:t>
+      </w:r>
+      <w:r>
+        <w:t xml:space="preserve"> </w:t>
+      </w:r>
+      <w:r>
+        <w:t xml:space="preserve">&amp;</w:t>
+      </w:r>
+      <w:r>
+        <w:t xml:space="preserve"> </w:t>
+      </w:r>
+      <w:r>
+        <w:t xml:space="preserve">Análisis</w:t>
+      </w:r>
+      <w:r>
+        <w:t xml:space="preserve"> </w:t>
+      </w:r>
+      <w:r>
+        <w:t xml:space="preserve">de</w:t>
+      </w:r>
+      <w:r>
+        <w:t xml:space="preserve"> </w:t>
+      </w:r>
+      <w:r>
+        <w:t xml:space="preserve">Datos</w:t>
+      </w:r>
+    </w:p>
+    <w:p>
+      <w:pPr>
+        <w:pStyle w:val="FirstParagraph"/>
+        <w:jc w:val="center"/>
+      </w:pPr>
+      <w:r>
+        <w:drawing>
+          <wp:inline>
+            <wp:extent cx="1095375" cy="1095375"/>
+            <wp:effectExtent b="0" l="0" r="0" t="0"/>
+            <wp:docPr descr="Foto de Jorge Gutierrez" title="" id="21" name="Picture"/>
+            <a:graphic>
+              <a:graphicData uri="http://schemas.openxmlformats.org/drawingml/2006/picture">
+                <pic:pic>
+                  <pic:nvPicPr>
+                    <pic:cNvPr descr="Foto de Jorge Gutierrez" id="22" name="Picture"/>
+                    <pic:cNvPicPr>
+                      <a:picLocks noChangeArrowheads="1" noChangeAspect="1"/>
+                    </pic:cNvPicPr>
+                  </pic:nvPicPr>
+                  <pic:blipFill>
+                    <a:blip r:embed="rId20"/>
+                    <a:stretch>
+                      <a:fillRect/>
+                    </a:stretch>
+                  </pic:blipFill>
+                  <pic:spPr bwMode="auto">
+                    <a:xfrm>
+                      <a:off x="0" y="0"/>
+                      <a:ext cx="1095375" cy="1095375"/>
+                    </a:xfrm>
+                    <a:prstGeom prst="rect">
+                      <a:avLst/>
+                    </a:prstGeom>
+                    <a:noFill/>
+                    <a:ln w="9525">
+                      <a:noFill/>
+                      <a:headEnd/>
+                      <a:tailEnd/>
+                    </a:ln>
+                  </pic:spPr>
+                </pic:pic>
+              </a:graphicData>
+            </a:graphic>
+          </wp:inline>
+        </w:drawing>
+      </w:r>
+    </w:p>
+    <w:p>
+      <w:pPr>
+        <w:pStyle w:val="BodyText"/>
+      </w:pPr>
+      <w:r>
+        <w:rPr>
+          <w:bCs/>
+          <w:b/>
+        </w:rPr>
+        <w:t xml:space="preserve">IT Support &amp; Management · Auditoría · Análisis de Datos · IA Aplicada</w:t>
+      </w:r>
+    </w:p>
+    <w:p>
+      <w:pPr>
+        <w:pStyle w:val="BodyText"/>
+      </w:pPr>
+      <w:r>
+        <w:t xml:space="preserve">jorge042888@gmail.com · (+57) 3024781168 · github.com/jorge042888</w:t>
+      </w:r>
+    </w:p>
+    <w:bookmarkStart w:id="23" w:name="perfil-profesional"/>
+    <w:p>
+      <w:pPr>
+        <w:pStyle w:val="Heading2"/>
+      </w:pPr>
+      <w:r>
+        <w:t xml:space="preserve">Perfil profesional</w:t>
+      </w:r>
+    </w:p>
+    <w:p>
+      <w:pPr>
+        <w:pStyle w:val="FirstParagraph"/>
+      </w:pPr>
+      <w:r>
+        <w:t xml:space="preserve">Técnico en sistemas / Estudiante de Ingeniería de Sistemas con experiencia combinada en</w:t>
+      </w:r>
+      <w:r>
+        <w:t xml:space="preserve"> </w:t>
+      </w:r>
+      <w:r>
+        <w:rPr>
+          <w:bCs/>
+          <w:b/>
+        </w:rPr>
+        <w:t xml:space="preserve">soporte y gestión TI</w:t>
+      </w:r>
+      <w:r>
+        <w:t xml:space="preserve">, análisis de datos y</w:t>
+      </w:r>
+      <w:r>
+        <w:t xml:space="preserve"> </w:t>
+      </w:r>
+      <w:r>
+        <w:rPr>
+          <w:bCs/>
+          <w:b/>
+        </w:rPr>
+        <w:t xml:space="preserve">evaluación de riesgos tecnológicos</w:t>
+      </w:r>
+      <w:r>
+        <w:t xml:space="preserve">. He brindado soporte técnico integral a usuarios finales (mantenimiento, configuración, redes) y he participado en la evaluación de procesos e infraestructura TI bajo el marco</w:t>
+      </w:r>
+      <w:r>
+        <w:t xml:space="preserve"> </w:t>
+      </w:r>
+      <w:r>
+        <w:rPr>
+          <w:bCs/>
+          <w:b/>
+        </w:rPr>
+        <w:t xml:space="preserve">ISO 27001</w:t>
+      </w:r>
+      <w:r>
+        <w:t xml:space="preserve">, identificando riesgos y proponiendo controles. Complemento este perfil con análisis funcional de datos en</w:t>
+      </w:r>
+      <w:r>
+        <w:t xml:space="preserve"> </w:t>
+      </w:r>
+      <w:r>
+        <w:rPr>
+          <w:bCs/>
+          <w:b/>
+        </w:rPr>
+        <w:t xml:space="preserve">Excel, Power BI, SQL y Python</w:t>
+      </w:r>
+      <w:r>
+        <w:t xml:space="preserve">, y con el uso activo de herramientas de</w:t>
+      </w:r>
+      <w:r>
+        <w:t xml:space="preserve"> </w:t>
+      </w:r>
+      <w:r>
+        <w:rPr>
+          <w:bCs/>
+          <w:b/>
+        </w:rPr>
+        <w:t xml:space="preserve">inteligencia artificial (Claude, ChatGPT Business, OpenCode)</w:t>
+      </w:r>
+      <w:r>
+        <w:t xml:space="preserve"> </w:t>
+      </w:r>
+      <w:r>
+        <w:t xml:space="preserve">para automatizar tareas técnicas y acelerar el análisis. Usuario de entorno Linux.</w:t>
+      </w:r>
+    </w:p>
+    <w:bookmarkEnd w:id="23"/>
+    <w:bookmarkStart w:id="24" w:name="habilidades-técnicas"/>
+    <w:p>
+      <w:pPr>
+        <w:pStyle w:val="Heading2"/>
+      </w:pPr>
+      <w:r>
+        <w:t xml:space="preserve">Habilidades técnicas</w:t>
+      </w:r>
+    </w:p>
+    <w:p>
+      <w:pPr>
+        <w:pStyle w:val="FirstParagraph"/>
+      </w:pPr>
+      <w:r>
+        <w:rPr>
+          <w:bCs/>
+          <w:b/>
+        </w:rPr>
+        <w:t xml:space="preserve">Skills:</w:t>
+      </w:r>
+      <w:r>
+        <w:t xml:space="preserve"> </w:t>
+      </w:r>
+      <w:r>
+        <w:t xml:space="preserve">Python · SQL · Excel · Power BI · Linux · VS Code · Claude · ChatGPT · OpenCode · GitHub</w:t>
+      </w:r>
+    </w:p>
+    <w:p>
+      <w:pPr>
+        <w:pStyle w:val="BodyText"/>
+      </w:pPr>
+      <w:r>
+        <w:rPr>
+          <w:bCs/>
+          <w:b/>
+        </w:rPr>
+        <w:t xml:space="preserve">IT Support &amp; Management</w:t>
+      </w:r>
+    </w:p>
+    <w:p>
+      <w:pPr>
+        <w:numPr>
+          <w:ilvl w:val="0"/>
+          <w:numId w:val="1001"/>
+        </w:numPr>
+        <w:pStyle w:val="Compact"/>
+      </w:pPr>
+      <w:r>
+        <w:t xml:space="preserve">Mantenimiento preventivo/correctivo</w:t>
+      </w:r>
+    </w:p>
+    <w:p>
+      <w:pPr>
+        <w:numPr>
+          <w:ilvl w:val="0"/>
+          <w:numId w:val="1001"/>
+        </w:numPr>
+        <w:pStyle w:val="Compact"/>
+      </w:pPr>
+      <w:r>
+        <w:t xml:space="preserve">Instalación y configuración HW/SW</w:t>
+      </w:r>
+    </w:p>
+    <w:p>
+      <w:pPr>
+        <w:numPr>
+          <w:ilvl w:val="0"/>
+          <w:numId w:val="1001"/>
+        </w:numPr>
+        <w:pStyle w:val="Compact"/>
+      </w:pPr>
+      <w:r>
+        <w:t xml:space="preserve">Recuperación/clonación de discos</w:t>
+      </w:r>
+    </w:p>
+    <w:p>
+      <w:pPr>
+        <w:numPr>
+          <w:ilvl w:val="0"/>
+          <w:numId w:val="1001"/>
+        </w:numPr>
+        <w:pStyle w:val="Compact"/>
+      </w:pPr>
+      <w:r>
+        <w:t xml:space="preserve">Soporte ofimático</w:t>
+      </w:r>
+    </w:p>
+    <w:p>
+      <w:pPr>
+        <w:numPr>
+          <w:ilvl w:val="0"/>
+          <w:numId w:val="1001"/>
+        </w:numPr>
+        <w:pStyle w:val="Compact"/>
+      </w:pPr>
+      <w:r>
+        <w:t xml:space="preserve">Diagnóstico de infraestructura TI</w:t>
+      </w:r>
+    </w:p>
+    <w:p>
+      <w:pPr>
+        <w:pStyle w:val="FirstParagraph"/>
+      </w:pPr>
+      <w:r>
+        <w:rPr>
+          <w:bCs/>
+          <w:b/>
+        </w:rPr>
+        <w:t xml:space="preserve">Riesgos &amp; Controles TI</w:t>
+      </w:r>
+    </w:p>
+    <w:p>
+      <w:pPr>
+        <w:numPr>
+          <w:ilvl w:val="0"/>
+          <w:numId w:val="1002"/>
+        </w:numPr>
+        <w:pStyle w:val="Compact"/>
+      </w:pPr>
+      <w:r>
+        <w:t xml:space="preserve">Levantamiento de información</w:t>
+      </w:r>
+    </w:p>
+    <w:p>
+      <w:pPr>
+        <w:numPr>
+          <w:ilvl w:val="0"/>
+          <w:numId w:val="1002"/>
+        </w:numPr>
+        <w:pStyle w:val="Compact"/>
+      </w:pPr>
+      <w:r>
+        <w:t xml:space="preserve">Evaluación de controles de seguridad</w:t>
+      </w:r>
+    </w:p>
+    <w:p>
+      <w:pPr>
+        <w:numPr>
+          <w:ilvl w:val="0"/>
+          <w:numId w:val="1002"/>
+        </w:numPr>
+        <w:pStyle w:val="Compact"/>
+      </w:pPr>
+      <w:r>
+        <w:t xml:space="preserve">Hallazgos y recomendaciones ISO 27001</w:t>
+      </w:r>
+    </w:p>
+    <w:p>
+      <w:pPr>
+        <w:numPr>
+          <w:ilvl w:val="0"/>
+          <w:numId w:val="1002"/>
+        </w:numPr>
+        <w:pStyle w:val="Compact"/>
+      </w:pPr>
+      <w:r>
+        <w:t xml:space="preserve">Apoyo en IA para auditoría</w:t>
+      </w:r>
+    </w:p>
+    <w:p>
+      <w:pPr>
+        <w:pStyle w:val="FirstParagraph"/>
+      </w:pPr>
+      <w:r>
+        <w:rPr>
+          <w:bCs/>
+          <w:b/>
+        </w:rPr>
+        <w:t xml:space="preserve">Análisis de datos</w:t>
+      </w:r>
+    </w:p>
+    <w:p>
+      <w:pPr>
+        <w:numPr>
+          <w:ilvl w:val="0"/>
+          <w:numId w:val="1003"/>
+        </w:numPr>
+        <w:pStyle w:val="Compact"/>
+      </w:pPr>
+      <w:r>
+        <w:t xml:space="preserve">Excel avanzado</w:t>
+      </w:r>
+    </w:p>
+    <w:p>
+      <w:pPr>
+        <w:numPr>
+          <w:ilvl w:val="0"/>
+          <w:numId w:val="1003"/>
+        </w:numPr>
+        <w:pStyle w:val="Compact"/>
+      </w:pPr>
+      <w:r>
+        <w:t xml:space="preserve">Power BI (modelado, editor de consultas, DAX)</w:t>
+      </w:r>
+    </w:p>
+    <w:p>
+      <w:pPr>
+        <w:numPr>
+          <w:ilvl w:val="0"/>
+          <w:numId w:val="1003"/>
+        </w:numPr>
+        <w:pStyle w:val="Compact"/>
+      </w:pPr>
+      <w:r>
+        <w:t xml:space="preserve">Python (Pandas, NumPy)</w:t>
+      </w:r>
+    </w:p>
+    <w:p>
+      <w:pPr>
+        <w:numPr>
+          <w:ilvl w:val="0"/>
+          <w:numId w:val="1003"/>
+        </w:numPr>
+        <w:pStyle w:val="Compact"/>
+      </w:pPr>
+      <w:r>
+        <w:t xml:space="preserve">SQL</w:t>
+      </w:r>
+    </w:p>
+    <w:p>
+      <w:pPr>
+        <w:pStyle w:val="FirstParagraph"/>
+      </w:pPr>
+      <w:r>
+        <w:rPr>
+          <w:bCs/>
+          <w:b/>
+        </w:rPr>
+        <w:t xml:space="preserve">IA aplicada</w:t>
+      </w:r>
+    </w:p>
+    <w:p>
+      <w:pPr>
+        <w:numPr>
+          <w:ilvl w:val="0"/>
+          <w:numId w:val="1004"/>
+        </w:numPr>
+        <w:pStyle w:val="Compact"/>
+      </w:pPr>
+      <w:r>
+        <w:t xml:space="preserve">Claude — automatización y documentación</w:t>
+      </w:r>
+    </w:p>
+    <w:p>
+      <w:pPr>
+        <w:numPr>
+          <w:ilvl w:val="0"/>
+          <w:numId w:val="1004"/>
+        </w:numPr>
+        <w:pStyle w:val="Compact"/>
+      </w:pPr>
+      <w:r>
+        <w:t xml:space="preserve">OpenCode — agentes de desarrollo</w:t>
+      </w:r>
+    </w:p>
+    <w:p>
+      <w:pPr>
+        <w:numPr>
+          <w:ilvl w:val="0"/>
+          <w:numId w:val="1004"/>
+        </w:numPr>
+        <w:pStyle w:val="Compact"/>
+      </w:pPr>
+      <w:r>
+        <w:t xml:space="preserve">ChatGPT Business — administración de cuentas, usuarios y grupos</w:t>
+      </w:r>
+    </w:p>
+    <w:bookmarkEnd w:id="24"/>
+    <w:bookmarkStart w:id="25" w:name="experiencia-laboral"/>
+    <w:p>
+      <w:pPr>
+        <w:pStyle w:val="Heading2"/>
+      </w:pPr>
+      <w:r>
+        <w:t xml:space="preserve">Experiencia laboral</w:t>
+      </w:r>
+    </w:p>
+    <w:p>
+      <w:pPr>
+        <w:pStyle w:val="FirstParagraph"/>
+      </w:pPr>
+      <w:r>
+        <w:rPr>
+          <w:bCs/>
+          <w:b/>
+        </w:rPr>
+        <w:t xml:space="preserve">Gonzalo Millán C. y Asociados</w:t>
+      </w:r>
+      <w:r>
+        <w:t xml:space="preserve"> </w:t>
+      </w:r>
+      <w:r>
+        <w:t xml:space="preserve">—</w:t>
+      </w:r>
+      <w:r>
+        <w:t xml:space="preserve"> </w:t>
+      </w:r>
+      <w:r>
+        <w:rPr>
+          <w:iCs/>
+          <w:i/>
+        </w:rPr>
+        <w:t xml:space="preserve">Actualmente</w:t>
+      </w:r>
+    </w:p>
+    <w:p>
+      <w:pPr>
+        <w:pStyle w:val="BodyText"/>
+      </w:pPr>
+      <w:r>
+        <w:t xml:space="preserve">Evaluación de infraestructura, procesos y controles de seguridad de la información en organizaciones clientes, bajo el marco ISO 27001. Identificación de riesgos tecnológicos y operativos, traducidos en informes con recomendaciones y oportunidades de mejora. Este rol me ha dado visión transversal de cómo se gestionan y aseguran los sistemas de información en distintos entornos.</w:t>
+      </w:r>
+    </w:p>
+    <w:p>
+      <w:pPr>
+        <w:pStyle w:val="BodyText"/>
+      </w:pPr>
+      <w:r>
+        <w:rPr>
+          <w:bCs/>
+          <w:b/>
+        </w:rPr>
+        <w:t xml:space="preserve">Independiente — Soporte T.I</w:t>
+      </w:r>
+      <w:r>
+        <w:t xml:space="preserve"> </w:t>
+      </w:r>
+      <w:r>
+        <w:t xml:space="preserve">—</w:t>
+      </w:r>
+      <w:r>
+        <w:t xml:space="preserve"> </w:t>
+      </w:r>
+      <w:r>
+        <w:rPr>
+          <w:iCs/>
+          <w:i/>
+        </w:rPr>
+        <w:t xml:space="preserve">2020 - 2022</w:t>
+      </w:r>
+    </w:p>
+    <w:p>
+      <w:pPr>
+        <w:pStyle w:val="BodyText"/>
+      </w:pPr>
+      <w:r>
+        <w:t xml:space="preserve">Soporte técnico integral a usuario final: mantenimiento preventivo y correctivo, instalación y configuración de software/hardware. Administración de licencias y aplicaciones de gestión de servicios. Capacitación funcional en Excel e Inteligencia Artificial orientada a productividad.</w:t>
+      </w:r>
+    </w:p>
+    <w:bookmarkEnd w:id="25"/>
+    <w:bookmarkStart w:id="26" w:name="formación-académica"/>
+    <w:p>
+      <w:pPr>
+        <w:pStyle w:val="Heading2"/>
+      </w:pPr>
+      <w:r>
+        <w:t xml:space="preserve">Formación académica</w:t>
+      </w:r>
+    </w:p>
+    <w:p>
+      <w:pPr>
+        <w:numPr>
+          <w:ilvl w:val="0"/>
+          <w:numId w:val="1005"/>
+        </w:numPr>
+        <w:pStyle w:val="Compact"/>
+      </w:pPr>
+      <w:r>
+        <w:rPr>
+          <w:bCs/>
+          <w:b/>
+        </w:rPr>
+        <w:t xml:space="preserve">Ingeniería de Sistemas</w:t>
+      </w:r>
+      <w:r>
+        <w:t xml:space="preserve"> </w:t>
+      </w:r>
+      <w:r>
+        <w:t xml:space="preserve">— en proceso, Corporación Universitaria Iberoamericana de Bogotá</w:t>
+      </w:r>
+    </w:p>
+    <w:p>
+      <w:pPr>
+        <w:numPr>
+          <w:ilvl w:val="0"/>
+          <w:numId w:val="1005"/>
+        </w:numPr>
+        <w:pStyle w:val="Compact"/>
+      </w:pPr>
+      <w:r>
+        <w:rPr>
+          <w:bCs/>
+          <w:b/>
+        </w:rPr>
+        <w:t xml:space="preserve">Técnico en Sistemas</w:t>
+      </w:r>
+      <w:r>
+        <w:t xml:space="preserve"> </w:t>
+      </w:r>
+      <w:r>
+        <w:t xml:space="preserve">— CENAL, 2019-2022</w:t>
+      </w:r>
+    </w:p>
+    <w:bookmarkEnd w:id="26"/>
+    <w:bookmarkStart w:id="27" w:name="idiomas"/>
+    <w:p>
+      <w:pPr>
+        <w:pStyle w:val="Heading2"/>
+      </w:pPr>
+      <w:r>
+        <w:t xml:space="preserve">Idiomas</w:t>
+      </w:r>
+    </w:p>
+    <w:p>
+      <w:pPr>
+        <w:numPr>
+          <w:ilvl w:val="0"/>
+          <w:numId w:val="1006"/>
+        </w:numPr>
+        <w:pStyle w:val="Compact"/>
+      </w:pPr>
+      <w:r>
+        <w:rPr>
+          <w:bCs/>
+          <w:b/>
+        </w:rPr>
+        <w:t xml:space="preserve">Español:</w:t>
+      </w:r>
+      <w:r>
+        <w:t xml:space="preserve"> </w:t>
+      </w:r>
+      <w:r>
+        <w:t xml:space="preserve">nativo</w:t>
+      </w:r>
+    </w:p>
+    <w:p>
+      <w:pPr>
+        <w:numPr>
+          <w:ilvl w:val="0"/>
+          <w:numId w:val="1006"/>
+        </w:numPr>
+        <w:pStyle w:val="Compact"/>
+      </w:pPr>
+      <w:r>
+        <w:rPr>
+          <w:bCs/>
+          <w:b/>
+        </w:rPr>
+        <w:t xml:space="preserve">Inglés:</w:t>
+      </w:r>
+      <w:r>
+        <w:t xml:space="preserve"> </w:t>
+      </w:r>
+      <w:r>
+        <w:t xml:space="preserve">B1</w:t>
+      </w:r>
+    </w:p>
+    <w:bookmarkEnd w:id="27"/>
+    <w:bookmarkStart w:id="28" w:name="referencias"/>
+    <w:p>
+      <w:pPr>
+        <w:pStyle w:val="Heading2"/>
+      </w:pPr>
+      <w:r>
+        <w:t xml:space="preserve">Referencias</w:t>
+      </w:r>
+    </w:p>
+    <w:p>
+      <w:pPr>
+        <w:pStyle w:val="FirstParagraph"/>
+      </w:pPr>
+      <w:r>
+        <w:t xml:space="preserve">Disponibles a solicitud.</w:t>
+      </w:r>
+    </w:p>
+    <w:bookmarkEnd w:id="28"/>
+    <w:sectPr/>
+  </w:body>
+</w:document>
 </file>
 
 <file path=word/comments.xml><?xml version="1.0" encoding="utf-8"?>

</xml_diff>